<commit_message>
docs: sync teammates' latest edits from the shared Word doc
Co-Authored-By: Claude Opus 5.5 <noreply@anthropic.com>
</commit_message>
<xml_diff>
--- a/reports/00_proposal.docx
+++ b/reports/00_proposal.docx
@@ -538,6 +538,7 @@
     </w:p>
     <w:p>
       <w:pPr>
+        <w:pStyle w:val="Normal"/>
         <w:spacing w:after="0" w:line="480" w:lineRule="auto"/>
         <w:jc w:val="center"/>
         <w:rPr>
@@ -558,109 +559,9 @@
     </w:p>
     <w:p>
       <w:pPr>
-        <w:spacing w:after="0" w:line="480" w:lineRule="auto"/>
-        <w:jc w:val="center"/>
-        <w:rPr>
-          <w:rFonts w:ascii="Times New Roman" w:hAnsi="Times New Roman" w:eastAsia="Times New Roman" w:cs="Times New Roman" w:asciiTheme="minorAscii" w:hAnsiTheme="minorAscii" w:eastAsiaTheme="minorAscii" w:cstheme="minorAscii"/>
-          <w:b w:val="0"/>
-          <w:bCs w:val="0"/>
-          <w:i w:val="0"/>
-          <w:iCs w:val="0"/>
-          <w:caps w:val="0"/>
-          <w:smallCaps w:val="0"/>
-          <w:noProof w:val="0"/>
-          <w:color w:val="auto"/>
-          <w:sz w:val="24"/>
-          <w:szCs w:val="24"/>
-          <w:lang w:val="en-US"/>
-        </w:rPr>
-      </w:pPr>
-    </w:p>
-    <w:p>
-      <w:pPr>
-        <w:spacing w:after="0" w:line="480" w:lineRule="auto"/>
-        <w:jc w:val="center"/>
-        <w:rPr>
-          <w:rFonts w:ascii="Times New Roman" w:hAnsi="Times New Roman" w:eastAsia="Times New Roman" w:cs="Times New Roman" w:asciiTheme="minorAscii" w:hAnsiTheme="minorAscii" w:eastAsiaTheme="minorAscii" w:cstheme="minorAscii"/>
-          <w:b w:val="0"/>
-          <w:bCs w:val="0"/>
-          <w:i w:val="0"/>
-          <w:iCs w:val="0"/>
-          <w:caps w:val="0"/>
-          <w:smallCaps w:val="0"/>
-          <w:noProof w:val="0"/>
-          <w:color w:val="auto"/>
-          <w:sz w:val="24"/>
-          <w:szCs w:val="24"/>
-          <w:lang w:val="en-US"/>
-        </w:rPr>
-      </w:pPr>
-    </w:p>
-    <w:p>
-      <w:pPr>
-        <w:spacing w:after="0" w:line="480" w:lineRule="auto"/>
-        <w:jc w:val="center"/>
-        <w:rPr>
-          <w:rFonts w:ascii="Times New Roman" w:hAnsi="Times New Roman" w:eastAsia="Times New Roman" w:cs="Times New Roman" w:asciiTheme="minorAscii" w:hAnsiTheme="minorAscii" w:eastAsiaTheme="minorAscii" w:cstheme="minorAscii"/>
-          <w:b w:val="0"/>
-          <w:bCs w:val="0"/>
-          <w:i w:val="0"/>
-          <w:iCs w:val="0"/>
-          <w:caps w:val="0"/>
-          <w:smallCaps w:val="0"/>
-          <w:noProof w:val="0"/>
-          <w:color w:val="auto"/>
-          <w:sz w:val="24"/>
-          <w:szCs w:val="24"/>
-          <w:lang w:val="en-US"/>
-        </w:rPr>
-      </w:pPr>
-    </w:p>
-    <w:p>
-      <w:pPr>
-        <w:spacing w:after="0" w:line="480" w:lineRule="auto"/>
-        <w:jc w:val="center"/>
-        <w:rPr>
-          <w:rFonts w:ascii="Times New Roman" w:hAnsi="Times New Roman" w:eastAsia="Times New Roman" w:cs="Times New Roman" w:asciiTheme="minorAscii" w:hAnsiTheme="minorAscii" w:eastAsiaTheme="minorAscii" w:cstheme="minorAscii"/>
-          <w:b w:val="0"/>
-          <w:bCs w:val="0"/>
-          <w:i w:val="0"/>
-          <w:iCs w:val="0"/>
-          <w:caps w:val="0"/>
-          <w:smallCaps w:val="0"/>
-          <w:noProof w:val="0"/>
-          <w:color w:val="auto"/>
-          <w:sz w:val="24"/>
-          <w:szCs w:val="24"/>
-          <w:lang w:val="en-US"/>
-        </w:rPr>
-      </w:pPr>
-    </w:p>
-    <w:p>
-      <w:pPr>
-        <w:pStyle w:val="Normal"/>
-        <w:spacing w:after="0" w:line="480" w:lineRule="auto"/>
-        <w:jc w:val="center"/>
-        <w:rPr>
-          <w:rFonts w:ascii="Times New Roman" w:hAnsi="Times New Roman" w:eastAsia="Times New Roman" w:cs="Times New Roman" w:asciiTheme="minorAscii" w:hAnsiTheme="minorAscii" w:eastAsiaTheme="minorAscii" w:cstheme="minorAscii"/>
-          <w:b w:val="0"/>
-          <w:bCs w:val="0"/>
-          <w:i w:val="0"/>
-          <w:iCs w:val="0"/>
-          <w:caps w:val="0"/>
-          <w:smallCaps w:val="0"/>
-          <w:noProof w:val="0"/>
-          <w:color w:val="auto"/>
-          <w:sz w:val="24"/>
-          <w:szCs w:val="24"/>
-          <w:lang w:val="en-US"/>
-        </w:rPr>
-      </w:pPr>
-    </w:p>
-    <w:p>
-      <w:pPr>
         <w:pStyle w:val="Heading2"/>
         <w:spacing w:before="299" w:beforeAutospacing="off" w:after="299" w:afterAutospacing="off" w:line="480" w:lineRule="auto"/>
+        <w:jc w:val="center"/>
         <w:rPr>
           <w:rFonts w:ascii="Times New Roman" w:hAnsi="Times New Roman" w:eastAsia="Times New Roman" w:cs="Times New Roman" w:asciiTheme="minorAscii" w:hAnsiTheme="minorAscii" w:eastAsiaTheme="minorAscii" w:cstheme="minorAscii"/>
           <w:b w:val="1"/>
@@ -801,6 +702,7 @@
     <w:p>
       <w:pPr>
         <w:spacing w:before="240" w:beforeAutospacing="off" w:after="240" w:afterAutospacing="off" w:line="480" w:lineRule="auto"/>
+        <w:jc w:val="center"/>
         <w:rPr>
           <w:rFonts w:ascii="Times New Roman" w:hAnsi="Times New Roman" w:eastAsia="Times New Roman" w:cs="Times New Roman" w:asciiTheme="minorAscii" w:hAnsiTheme="minorAscii" w:eastAsiaTheme="minorAscii" w:cstheme="minorAscii"/>
           <w:b w:val="1"/>
@@ -823,7 +725,7 @@
           <w:szCs w:val="24"/>
           <w:lang w:val="en-US"/>
         </w:rPr>
-        <w:t>Supporting sources.</w:t>
+        <w:t>Supporting Sources</w:t>
       </w:r>
     </w:p>
     <w:p>
@@ -1003,6 +905,7 @@
     <w:p>
       <w:pPr>
         <w:spacing w:before="240" w:beforeAutospacing="off" w:after="240" w:afterAutospacing="off" w:line="480" w:lineRule="auto"/>
+        <w:jc w:val="center"/>
         <w:rPr>
           <w:rFonts w:ascii="Times New Roman" w:hAnsi="Times New Roman" w:eastAsia="Times New Roman" w:cs="Times New Roman" w:asciiTheme="minorAscii" w:hAnsiTheme="minorAscii" w:eastAsiaTheme="minorAscii" w:cstheme="minorAscii"/>
           <w:b w:val="1"/>
@@ -1025,7 +928,7 @@
           <w:szCs w:val="24"/>
           <w:lang w:val="en-US"/>
         </w:rPr>
-        <w:t>Opposing sources.</w:t>
+        <w:t>Opposing Sources</w:t>
       </w:r>
     </w:p>
     <w:p>
@@ -1152,8 +1055,42 @@
     </w:p>
     <w:p>
       <w:pPr>
+        <w:spacing w:line="480" w:lineRule="auto"/>
+        <w:rPr>
+          <w:rFonts w:ascii="Times New Roman" w:hAnsi="Times New Roman" w:eastAsia="Times New Roman" w:cs="Times New Roman" w:asciiTheme="minorAscii" w:hAnsiTheme="minorAscii" w:eastAsiaTheme="minorAscii" w:cstheme="minorAscii"/>
+          <w:color w:val="auto"/>
+          <w:sz w:val="24"/>
+          <w:szCs w:val="24"/>
+        </w:rPr>
+      </w:pPr>
+    </w:p>
+    <w:p>
+      <w:pPr>
+        <w:spacing w:line="480" w:lineRule="auto"/>
+        <w:rPr>
+          <w:rFonts w:ascii="Times New Roman" w:hAnsi="Times New Roman" w:eastAsia="Times New Roman" w:cs="Times New Roman" w:asciiTheme="minorAscii" w:hAnsiTheme="minorAscii" w:eastAsiaTheme="minorAscii" w:cstheme="minorAscii"/>
+          <w:color w:val="auto"/>
+          <w:sz w:val="24"/>
+          <w:szCs w:val="24"/>
+        </w:rPr>
+      </w:pPr>
+    </w:p>
+    <w:p>
+      <w:pPr>
+        <w:spacing w:line="480" w:lineRule="auto"/>
+        <w:rPr>
+          <w:rFonts w:ascii="Times New Roman" w:hAnsi="Times New Roman" w:eastAsia="Times New Roman" w:cs="Times New Roman" w:asciiTheme="minorAscii" w:hAnsiTheme="minorAscii" w:eastAsiaTheme="minorAscii" w:cstheme="minorAscii"/>
+          <w:color w:val="auto"/>
+          <w:sz w:val="24"/>
+          <w:szCs w:val="24"/>
+        </w:rPr>
+      </w:pPr>
+    </w:p>
+    <w:p>
+      <w:pPr>
         <w:pStyle w:val="Heading2"/>
         <w:spacing w:before="299" w:beforeAutospacing="off" w:after="299" w:afterAutospacing="off" w:line="480" w:lineRule="auto"/>
+        <w:jc w:val="center"/>
         <w:rPr>
           <w:rFonts w:ascii="Times New Roman" w:hAnsi="Times New Roman" w:eastAsia="Times New Roman" w:cs="Times New Roman" w:asciiTheme="minorAscii" w:hAnsiTheme="minorAscii" w:eastAsiaTheme="minorAscii" w:cstheme="minorAscii"/>
           <w:b w:val="1"/>
@@ -1439,7 +1376,7 @@
                 <w:sz w:val="24"/>
                 <w:szCs w:val="24"/>
               </w:rPr>
-              <w:t>Define Project Scope, managing timelines, final project presentation</w:t>
+              <w:t>Define Project Scope, managing timelines, chatbot testing, validate functionality and response accuracy, final project presentation</w:t>
             </w:r>
           </w:p>
         </w:tc>
@@ -1596,7 +1533,12 @@
           </w:tcPr>
           <w:p>
             <w:pPr>
-              <w:spacing w:before="0" w:beforeAutospacing="off" w:after="0" w:afterAutospacing="off" w:line="480" w:lineRule="auto"/>
+              <w:pStyle w:val="Normal"/>
+              <w:suppressLineNumbers w:val="0"/>
+              <w:bidi w:val="0"/>
+              <w:spacing w:before="0" w:beforeAutospacing="off" w:after="0" w:afterAutospacing="off" w:line="480" w:lineRule="auto"/>
+              <w:ind w:left="0" w:right="0"/>
+              <w:jc w:val="left"/>
             </w:pPr>
             <w:r>
               <w:rPr>
@@ -1607,7 +1549,7 @@
                 <w:sz w:val="24"/>
                 <w:szCs w:val="24"/>
               </w:rPr>
-              <w:t>@deepksde</w:t>
+              <w:t>@deepkse</w:t>
             </w:r>
           </w:p>
         </w:tc>
@@ -2159,21 +2101,10 @@
     </w:p>
     <w:p>
       <w:pPr>
-        <w:bidi w:val="0"/>
-        <w:spacing w:line="480" w:lineRule="auto"/>
-        <w:rPr>
-          <w:rFonts w:ascii="Times New Roman" w:hAnsi="Times New Roman" w:eastAsia="Times New Roman" w:cs="Times New Roman" w:asciiTheme="minorAscii" w:hAnsiTheme="minorAscii" w:eastAsiaTheme="minorAscii" w:cstheme="minorAscii"/>
-          <w:color w:val="auto"/>
-          <w:sz w:val="24"/>
-          <w:szCs w:val="24"/>
-        </w:rPr>
-      </w:pPr>
-    </w:p>
-    <w:p>
-      <w:pPr>
         <w:pStyle w:val="Heading2"/>
         <w:bidi w:val="0"/>
         <w:spacing w:before="299" w:beforeAutospacing="off" w:after="299" w:afterAutospacing="off" w:line="480" w:lineRule="auto"/>
+        <w:jc w:val="center"/>
         <w:rPr>
           <w:rFonts w:ascii="Times New Roman" w:hAnsi="Times New Roman" w:eastAsia="Times New Roman" w:cs="Times New Roman" w:asciiTheme="minorAscii" w:hAnsiTheme="minorAscii" w:eastAsiaTheme="minorAscii" w:cstheme="minorAscii"/>
           <w:b w:val="1"/>
@@ -3072,21 +3003,10 @@
     </w:p>
     <w:p>
       <w:pPr>
-        <w:bidi w:val="0"/>
-        <w:spacing w:line="480" w:lineRule="auto"/>
-        <w:rPr>
-          <w:rFonts w:ascii="Times New Roman" w:hAnsi="Times New Roman" w:eastAsia="Times New Roman" w:cs="Times New Roman" w:asciiTheme="minorAscii" w:hAnsiTheme="minorAscii" w:eastAsiaTheme="minorAscii" w:cstheme="minorAscii"/>
-          <w:color w:val="auto"/>
-          <w:sz w:val="24"/>
-          <w:szCs w:val="24"/>
-        </w:rPr>
-      </w:pPr>
-    </w:p>
-    <w:p>
-      <w:pPr>
         <w:pStyle w:val="Heading2"/>
         <w:bidi w:val="0"/>
         <w:spacing w:before="299" w:beforeAutospacing="off" w:after="299" w:afterAutospacing="off" w:line="480" w:lineRule="auto"/>
+        <w:jc w:val="center"/>
         <w:rPr>
           <w:rFonts w:ascii="Times New Roman" w:hAnsi="Times New Roman" w:eastAsia="Times New Roman" w:cs="Times New Roman" w:asciiTheme="minorAscii" w:hAnsiTheme="minorAscii" w:eastAsiaTheme="minorAscii" w:cstheme="minorAscii"/>
           <w:b w:val="1"/>
@@ -4049,21 +3969,10 @@
     </w:tbl>
     <w:p>
       <w:pPr>
-        <w:bidi w:val="0"/>
-        <w:spacing w:line="480" w:lineRule="auto"/>
-        <w:rPr>
-          <w:rFonts w:ascii="Times New Roman" w:hAnsi="Times New Roman" w:eastAsia="Times New Roman" w:cs="Times New Roman" w:asciiTheme="minorAscii" w:hAnsiTheme="minorAscii" w:eastAsiaTheme="minorAscii" w:cstheme="minorAscii"/>
-          <w:color w:val="auto"/>
-          <w:sz w:val="24"/>
-          <w:szCs w:val="24"/>
-        </w:rPr>
-      </w:pPr>
-    </w:p>
-    <w:p>
-      <w:pPr>
         <w:pStyle w:val="Heading2"/>
         <w:bidi w:val="0"/>
         <w:spacing w:before="299" w:beforeAutospacing="off" w:after="299" w:afterAutospacing="off" w:line="480" w:lineRule="auto"/>
+        <w:jc w:val="center"/>
         <w:rPr>
           <w:rFonts w:ascii="Times New Roman" w:hAnsi="Times New Roman" w:eastAsia="Times New Roman" w:cs="Times New Roman" w:asciiTheme="minorAscii" w:hAnsiTheme="minorAscii" w:eastAsiaTheme="minorAscii" w:cstheme="minorAscii"/>
           <w:b w:val="1"/>
@@ -4523,6 +4432,7 @@
         <w:pStyle w:val="Heading2"/>
         <w:bidi w:val="0"/>
         <w:spacing w:before="299" w:beforeAutospacing="off" w:after="299" w:afterAutospacing="off" w:line="480" w:lineRule="auto"/>
+        <w:jc w:val="center"/>
         <w:rPr>
           <w:rFonts w:ascii="Times New Roman" w:hAnsi="Times New Roman" w:eastAsia="Times New Roman" w:cs="Times New Roman" w:asciiTheme="minorAscii" w:hAnsiTheme="minorAscii" w:eastAsiaTheme="minorAscii" w:cstheme="minorAscii"/>
           <w:b w:val="1"/>
@@ -4748,24 +4658,13 @@
         </w:rPr>
         <w:t xml:space="preserve"> after indexing strategy B, we delete with where={"strategy": "A"}, then assert that a count query for strategy = A returns 0 and that every remaining ID's doc_id exists in the current docs.jsonl. We re-run the same golden set and report the delta.</w:t>
       </w:r>
-    </w:p>
-    <w:p>
-      <w:pPr>
-        <w:bidi w:val="0"/>
-        <w:spacing w:line="480" w:lineRule="auto"/>
-        <w:rPr>
-          <w:rFonts w:ascii="Times New Roman" w:hAnsi="Times New Roman" w:eastAsia="Times New Roman" w:cs="Times New Roman" w:asciiTheme="minorAscii" w:hAnsiTheme="minorAscii" w:eastAsiaTheme="minorAscii" w:cstheme="minorAscii"/>
-          <w:color w:val="auto"/>
-          <w:sz w:val="24"/>
-          <w:szCs w:val="24"/>
-        </w:rPr>
-      </w:pPr>
     </w:p>
     <w:p>
       <w:pPr>
         <w:pStyle w:val="Heading2"/>
         <w:bidi w:val="0"/>
         <w:spacing w:before="299" w:beforeAutospacing="off" w:after="299" w:afterAutospacing="off" w:line="480" w:lineRule="auto"/>
+        <w:jc w:val="center"/>
         <w:rPr>
           <w:rFonts w:ascii="Times New Roman" w:hAnsi="Times New Roman" w:eastAsia="Times New Roman" w:cs="Times New Roman" w:asciiTheme="minorAscii" w:hAnsiTheme="minorAscii" w:eastAsiaTheme="minorAscii" w:cstheme="minorAscii"/>
           <w:b w:val="1"/>
@@ -5051,18 +4950,6 @@
     </w:p>
     <w:p>
       <w:pPr>
-        <w:bidi w:val="0"/>
-        <w:spacing w:line="480" w:lineRule="auto"/>
-        <w:rPr>
-          <w:rFonts w:ascii="Times New Roman" w:hAnsi="Times New Roman" w:eastAsia="Times New Roman" w:cs="Times New Roman" w:asciiTheme="minorAscii" w:hAnsiTheme="minorAscii" w:eastAsiaTheme="minorAscii" w:cstheme="minorAscii"/>
-          <w:color w:val="auto"/>
-          <w:sz w:val="24"/>
-          <w:szCs w:val="24"/>
-        </w:rPr>
-      </w:pPr>
-    </w:p>
-    <w:p>
-      <w:pPr>
         <w:pStyle w:val="Heading2"/>
         <w:bidi w:val="0"/>
         <w:spacing w:before="299" w:beforeAutospacing="off" w:after="299" w:afterAutospacing="off" w:line="480" w:lineRule="auto"/>
@@ -5355,18 +5242,6 @@
         </w:rPr>
         <w:t>The UI shows the answer with clickable citations, a "data as of" date, and an expandable trace of all 20 candidates with pre- and post-rerank scores — or the refusal / referral message.</w:t>
       </w:r>
-    </w:p>
-    <w:p>
-      <w:pPr>
-        <w:bidi w:val="0"/>
-        <w:spacing w:line="480" w:lineRule="auto"/>
-        <w:rPr>
-          <w:rFonts w:ascii="Times New Roman" w:hAnsi="Times New Roman" w:eastAsia="Times New Roman" w:cs="Times New Roman" w:asciiTheme="minorAscii" w:hAnsiTheme="minorAscii" w:eastAsiaTheme="minorAscii" w:cstheme="minorAscii"/>
-          <w:color w:val="auto"/>
-          <w:sz w:val="24"/>
-          <w:szCs w:val="24"/>
-        </w:rPr>
-      </w:pPr>
     </w:p>
     <w:p>
       <w:pPr>
@@ -6320,18 +6195,6 @@
     </w:p>
     <w:p>
       <w:pPr>
-        <w:bidi w:val="0"/>
-        <w:spacing w:line="480" w:lineRule="auto"/>
-        <w:rPr>
-          <w:rFonts w:ascii="Times New Roman" w:hAnsi="Times New Roman" w:eastAsia="Times New Roman" w:cs="Times New Roman" w:asciiTheme="minorAscii" w:hAnsiTheme="minorAscii" w:eastAsiaTheme="minorAscii" w:cstheme="minorAscii"/>
-          <w:color w:val="auto"/>
-          <w:sz w:val="24"/>
-          <w:szCs w:val="24"/>
-        </w:rPr>
-      </w:pPr>
-    </w:p>
-    <w:p>
-      <w:pPr>
         <w:pStyle w:val="Heading2"/>
         <w:bidi w:val="0"/>
         <w:spacing w:before="299" w:beforeAutospacing="off" w:after="299" w:afterAutospacing="off" w:line="480" w:lineRule="auto"/>
@@ -6940,18 +6803,6 @@
         </w:tc>
       </w:tr>
     </w:tbl>
-    <w:p>
-      <w:pPr>
-        <w:bidi w:val="0"/>
-        <w:spacing w:line="480" w:lineRule="auto"/>
-        <w:rPr>
-          <w:rFonts w:ascii="Times New Roman" w:hAnsi="Times New Roman" w:eastAsia="Times New Roman" w:cs="Times New Roman" w:asciiTheme="minorAscii" w:hAnsiTheme="minorAscii" w:eastAsiaTheme="minorAscii" w:cstheme="minorAscii"/>
-          <w:color w:val="auto"/>
-          <w:sz w:val="24"/>
-          <w:szCs w:val="24"/>
-        </w:rPr>
-      </w:pPr>
-    </w:p>
     <w:p>
       <w:pPr>
         <w:pStyle w:val="Heading2"/>
@@ -7686,18 +7537,6 @@
     </w:p>
     <w:p>
       <w:pPr>
-        <w:bidi w:val="0"/>
-        <w:spacing w:line="480" w:lineRule="auto"/>
-        <w:rPr>
-          <w:rFonts w:ascii="Times New Roman" w:hAnsi="Times New Roman" w:eastAsia="Times New Roman" w:cs="Times New Roman" w:asciiTheme="minorAscii" w:hAnsiTheme="minorAscii" w:eastAsiaTheme="minorAscii" w:cstheme="minorAscii"/>
-          <w:color w:val="auto"/>
-          <w:sz w:val="24"/>
-          <w:szCs w:val="24"/>
-        </w:rPr>
-      </w:pPr>
-    </w:p>
-    <w:p>
-      <w:pPr>
         <w:pStyle w:val="Heading2"/>
         <w:bidi w:val="0"/>
         <w:spacing w:before="299" w:beforeAutospacing="off" w:after="299" w:afterAutospacing="off" w:line="480" w:lineRule="auto"/>
@@ -7737,7 +7576,7 @@
           <w:szCs w:val="24"/>
         </w:rPr>
       </w:pPr>
-      <w:hyperlink r:id="R5aafd5a88e22433a">
+      <w:hyperlink r:id="R64a02763d50f462c">
         <w:r>
           <w:rPr>
             <w:rStyle w:val="Hyperlink"/>
@@ -8054,7 +7893,7 @@
         </w:rPr>
         <w:t xml:space="preserve">, 758–759. </w:t>
       </w:r>
-      <w:hyperlink r:id="R88042657cdc04d89">
+      <w:hyperlink r:id="R249b1d001b814485">
         <w:r>
           <w:rPr>
             <w:rStyle w:val="Hyperlink"/>
@@ -8115,7 +7954,7 @@
         </w:rPr>
         <w:t xml:space="preserve">, 150–158. </w:t>
       </w:r>
-      <w:hyperlink r:id="R812a9bf2a0b044b3">
+      <w:hyperlink r:id="R1e71da19230f4255">
         <w:r>
           <w:rPr>
             <w:rStyle w:val="Hyperlink"/>
@@ -8176,7 +8015,7 @@
         </w:rPr>
         <w:t xml:space="preserve">, 6769–6781. </w:t>
       </w:r>
-      <w:hyperlink r:id="R4547da13948741c5">
+      <w:hyperlink r:id="R8da55bb287ba4a86">
         <w:r>
           <w:rPr>
             <w:rStyle w:val="Hyperlink"/>
@@ -8237,7 +8076,7 @@
         </w:rPr>
         <w:t xml:space="preserve">, 9459–9474. </w:t>
       </w:r>
-      <w:hyperlink r:id="Rba95f0559d704655">
+      <w:hyperlink r:id="R35982f3e5f9e4a75">
         <w:r>
           <w:rPr>
             <w:rStyle w:val="Hyperlink"/>
@@ -8298,7 +8137,7 @@
         </w:rPr>
         <w:t xml:space="preserve">, 157–173. </w:t>
       </w:r>
-      <w:hyperlink r:id="R543345d0221e406a">
+      <w:hyperlink r:id="R07507c742bd64dcc">
         <w:r>
           <w:rPr>
             <w:rStyle w:val="Hyperlink"/>
@@ -8359,7 +8198,7 @@
         </w:rPr>
         <w:t xml:space="preserve"> arXiv:1901.04085. </w:t>
       </w:r>
-      <w:hyperlink r:id="R71007fff116e486a">
+      <w:hyperlink r:id="R36d155c722844ea4">
         <w:r>
           <w:rPr>
             <w:rStyle w:val="Hyperlink"/>
@@ -8481,7 +8320,7 @@
         </w:rPr>
         <w:t xml:space="preserve">. </w:t>
       </w:r>
-      <w:hyperlink r:id="Rab704ef6bd754c34">
+      <w:hyperlink r:id="R841c55528f13495b">
         <w:r>
           <w:rPr>
             <w:rStyle w:val="Hyperlink"/>
@@ -8513,8 +8352,8 @@
       <w:pgMar w:top="1440" w:right="1440" w:bottom="1440" w:left="1440" w:header="720" w:footer="720" w:gutter="0"/>
       <w:cols w:space="720"/>
       <w:docGrid w:linePitch="360"/>
-      <w:headerReference w:type="default" r:id="Ree59fcac9ebd456a"/>
-      <w:footerReference w:type="default" r:id="R9a7583abde094f9c"/>
+      <w:headerReference w:type="default" r:id="R65c500ad8aef47e1"/>
+      <w:footerReference w:type="default" r:id="Rfa4b4ee198294814"/>
     </w:sectPr>
   </w:body>
 </w:document>
@@ -9614,7 +9453,7 @@
     <w:name w:val="header"/>
     <w:basedOn w:val="Normal"/>
     <w:unhideWhenUsed/>
-    <w:rsid w:val="1290F6AB"/>
+    <w:rsid w:val="46E30784"/>
     <w:pPr>
       <w:tabs>
         <w:tab w:val="center" w:leader="none" w:pos="4680"/>
@@ -9628,7 +9467,7 @@
     <w:name w:val="footer"/>
     <w:basedOn w:val="Normal"/>
     <w:unhideWhenUsed/>
-    <w:rsid w:val="1290F6AB"/>
+    <w:rsid w:val="46E30784"/>
     <w:pPr>
       <w:tabs>
         <w:tab w:val="center" w:leader="none" w:pos="4680"/>
@@ -9644,7 +9483,7 @@
     <w:next w:val="Normal"/>
     <w:unhideWhenUsed/>
     <w:qFormat/>
-    <w:rsid w:val="1290F6AB"/>
+    <w:rsid w:val="46E30784"/>
     <w:rPr>
       <w:rFonts w:ascii="Aptos Display" w:hAnsi="Aptos Display" w:eastAsia="" w:cs="" w:asciiTheme="majorAscii" w:hAnsiTheme="majorAscii" w:eastAsiaTheme="majorEastAsia" w:cstheme="majorBidi"/>
       <w:color w:val="0F4761" w:themeColor="accent1" w:themeTint="FF" w:themeShade="BF"/>
@@ -9663,7 +9502,7 @@
     <w:name w:val="List Paragraph"/>
     <w:basedOn w:val="Normal"/>
     <w:qFormat/>
-    <w:rsid w:val="1290F6AB"/>
+    <w:rsid w:val="46E30784"/>
     <w:pPr>
       <w:spacing/>
       <w:ind w:left="720"/>
@@ -9675,7 +9514,7 @@
     <w:name w:val="Hyperlink"/>
     <w:basedOn w:val="DefaultParagraphFont"/>
     <w:unhideWhenUsed/>
-    <w:rsid w:val="1290F6AB"/>
+    <w:rsid w:val="46E30784"/>
     <w:rPr>
       <w:color w:val="467886"/>
       <w:u w:val="single"/>

</xml_diff>